<commit_message>
Actualización de archivo Word y PDF
</commit_message>
<xml_diff>
--- a/Evidencia de Desempeño y Producto — Proyecto en Python Jair.docx
+++ b/Evidencia de Desempeño y Producto — Proyecto en Python Jair.docx
@@ -209,11 +209,30 @@
       </w:hyperlink>
     </w:p>
     <w:p>
-      <w:pPr>
-        <w:ind w:firstLine="720"/>
-      </w:pPr>
       <w:r>
         <w:t>Cada uno de los ejercicios está organizado y comentado dentro del archivo principal del proyecto, demostrando el uso correcto de entrada de datos, operaciones matemáticas, condicionales y estructuras de almacenamiento como listas y matrices.</w:t>
+      </w:r>
+      <w:r>
+        <w:t xml:space="preserve"> La carpeta donde se encuentra el código de estos ejercicios es </w:t>
+      </w:r>
+      <w:proofErr w:type="spellStart"/>
+      <w:r>
+        <w:rPr>
+          <w:b/>
+          <w:bCs/>
+        </w:rPr>
+        <w:t>mi_proyecto_python</w:t>
+      </w:r>
+      <w:proofErr w:type="spellEnd"/>
+      <w:r>
+        <w:rPr>
+          <w:b/>
+          <w:bCs/>
+        </w:rPr>
+        <w:t xml:space="preserve">, </w:t>
+      </w:r>
+      <w:r>
+        <w:t>esta se puede descargar y ejecutar para comprobar la funcionalidad de cada uno.</w:t>
       </w:r>
     </w:p>
     <w:p>
@@ -290,6 +309,7 @@
         <w:pStyle w:val="Ttulo2"/>
       </w:pPr>
       <w:r>
+        <w:lastRenderedPageBreak/>
         <w:t>3. Descuento en supermercado</w:t>
       </w:r>
     </w:p>
@@ -306,7 +326,6 @@
         </w:numPr>
       </w:pPr>
       <w:r>
-        <w:lastRenderedPageBreak/>
         <w:t xml:space="preserve">Si el número es menor que 74, el descuento es del </w:t>
       </w:r>
       <w:r>
@@ -596,6 +615,7 @@
         <w:pStyle w:val="Ttulo2"/>
       </w:pPr>
       <w:r>
+        <w:lastRenderedPageBreak/>
         <w:t>6. Matriz de calificaciones</w:t>
       </w:r>
     </w:p>
@@ -620,7 +640,6 @@
     </w:p>
     <w:p>
       <w:r>
-        <w:lastRenderedPageBreak/>
         <w:t>El programa:</w:t>
       </w:r>
     </w:p>
@@ -932,6 +951,7 @@
           <w:b/>
           <w:bCs/>
         </w:rPr>
+        <w:lastRenderedPageBreak/>
         <w:t>Abrir la terminal</w:t>
       </w:r>
     </w:p>
@@ -989,7 +1009,6 @@
           <w:b/>
           <w:bCs/>
         </w:rPr>
-        <w:lastRenderedPageBreak/>
         <w:t>Ingresar al directorio del proyecto</w:t>
       </w:r>
     </w:p>
@@ -5503,28 +5522,28 @@
 </file>
 
 <file path=customXml/item1.xml><?xml version="1.0" encoding="utf-8"?>
+<b:Sources xmlns:b="http://schemas.openxmlformats.org/officeDocument/2006/bibliography" xmlns="http://schemas.openxmlformats.org/officeDocument/2006/bibliography" SelectedStyle="\APASixthEditionOfficeOnline.xsl" StyleName="APA" Version="6"/>
+</file>
+
+<file path=customXml/item2.xml><?xml version="1.0" encoding="utf-8"?>
 <go:gDocsCustomXmlDataStorage xmlns:go="http://customooxmlschemas.google.com/" xmlns:r="http://schemas.openxmlformats.org/officeDocument/2006/relationships" uri="GoogleDocsCustomDataVersion2">
   <go:docsCustomData xmlns:go="http://customooxmlschemas.google.com/" roundtripDataSignature="AMtx7mgjIi8mV/ll7RC7RGGXrONUlBLqNw==">CgMxLjAyDmgubjZ6NWc0dTI2b2kzMg5oLm9mYTFhemt2NXJhbTIOaC45YXdpd2prZWp5YmMyDmguaWwwMTZiMnQzYXMzMg5oLjY3eXl2dTdkdmFuYTgAciExbk1zQVJYN1ZyVTR2b0Joc1hRSmY1enRLM2JXWVhrZDU=</go:docsCustomData>
 </go:gDocsCustomXmlDataStorage>
 </file>
 
-<file path=customXml/item2.xml><?xml version="1.0" encoding="utf-8"?>
-<b:Sources xmlns:b="http://schemas.openxmlformats.org/officeDocument/2006/bibliography" xmlns="http://schemas.openxmlformats.org/officeDocument/2006/bibliography" SelectedStyle="\APASixthEditionOfficeOnline.xsl" StyleName="APA" Version="6"/>
+<file path=customXml/itemProps1.xml><?xml version="1.0" encoding="utf-8"?>
+<ds:datastoreItem xmlns:ds="http://schemas.openxmlformats.org/officeDocument/2006/customXml" ds:itemID="{2EC9EC03-D02E-4056-A37D-CA6E9DCD92DB}">
+  <ds:schemaRefs>
+    <ds:schemaRef ds:uri="http://schemas.openxmlformats.org/officeDocument/2006/bibliography"/>
+  </ds:schemaRefs>
+</ds:datastoreItem>
 </file>
 
-<file path=customXml/itemProps1.xml><?xml version="1.0" encoding="utf-8"?>
+<file path=customXml/itemProps2.xml><?xml version="1.0" encoding="utf-8"?>
 <ds:datastoreItem xmlns:ds="http://schemas.openxmlformats.org/officeDocument/2006/customXml" ds:itemID="{11111111-1234-1234-1234-123412341234}">
   <ds:schemaRefs>
     <ds:schemaRef ds:uri="http://customooxmlschemas.google.com/"/>
     <ds:schemaRef ds:uri="http://schemas.openxmlformats.org/officeDocument/2006/relationships"/>
   </ds:schemaRefs>
 </ds:datastoreItem>
-</file>
-
-<file path=customXml/itemProps2.xml><?xml version="1.0" encoding="utf-8"?>
-<ds:datastoreItem xmlns:ds="http://schemas.openxmlformats.org/officeDocument/2006/customXml" ds:itemID="{2EC9EC03-D02E-4056-A37D-CA6E9DCD92DB}">
-  <ds:schemaRefs>
-    <ds:schemaRef ds:uri="http://schemas.openxmlformats.org/officeDocument/2006/bibliography"/>
-  </ds:schemaRefs>
-</ds:datastoreItem>
 </file>
</xml_diff>